<commit_message>
neuralop fno training mit darcy flow erfolgreich getestet
</commit_message>
<xml_diff>
--- a/Quellen/Quellendurchsicht/Dhamrait_2026_Memory_Scaling_of_Rev-Diff_in_Space_Charge_Sims.docx
+++ b/Quellen/Quellendurchsicht/Dhamrait_2026_Memory_Scaling_of_Rev-Diff_in_Space_Charge_Sims.docx
@@ -58,87 +58,7 @@
           <w:rStyle w:val="SchwacheHervorhebung"/>
           <w:lang w:val="en-US"/>
         </w:rPr>
-        <w:t xml:space="preserve">Von A. </w:t>
-      </w:r>
-      <w:proofErr w:type="spellStart"/>
-      <w:r>
-        <w:rPr>
-          <w:rStyle w:val="SchwacheHervorhebung"/>
-          <w:lang w:val="en-US"/>
-        </w:rPr>
-        <w:t>Dhamrait</w:t>
-      </w:r>
-      <w:proofErr w:type="spellEnd"/>
-      <w:r>
-        <w:rPr>
-          <w:rStyle w:val="SchwacheHervorhebung"/>
-          <w:lang w:val="en-US"/>
-        </w:rPr>
-        <w:t xml:space="preserve">, E. </w:t>
-      </w:r>
-      <w:proofErr w:type="spellStart"/>
-      <w:r>
-        <w:rPr>
-          <w:rStyle w:val="SchwacheHervorhebung"/>
-          <w:lang w:val="en-US"/>
-        </w:rPr>
-        <w:t>Zoni</w:t>
-      </w:r>
-      <w:proofErr w:type="spellEnd"/>
-      <w:r>
-        <w:rPr>
-          <w:rStyle w:val="SchwacheHervorhebung"/>
-          <w:lang w:val="en-US"/>
-        </w:rPr>
-        <w:t xml:space="preserve">, A. </w:t>
-      </w:r>
-      <w:proofErr w:type="spellStart"/>
-      <w:r>
-        <w:rPr>
-          <w:rStyle w:val="SchwacheHervorhebung"/>
-          <w:lang w:val="en-US"/>
-        </w:rPr>
-        <w:t>Huebl</w:t>
-      </w:r>
-      <w:proofErr w:type="spellEnd"/>
-      <w:r>
-        <w:rPr>
-          <w:rStyle w:val="SchwacheHervorhebung"/>
-          <w:lang w:val="en-US"/>
-        </w:rPr>
-        <w:t xml:space="preserve">, J. </w:t>
-      </w:r>
-      <w:proofErr w:type="spellStart"/>
-      <w:r>
-        <w:rPr>
-          <w:rStyle w:val="SchwacheHervorhebung"/>
-          <w:lang w:val="en-US"/>
-        </w:rPr>
-        <w:t>Qiang</w:t>
-      </w:r>
-      <w:proofErr w:type="spellEnd"/>
-      <w:r>
-        <w:rPr>
-          <w:rStyle w:val="SchwacheHervorhebung"/>
-          <w:lang w:val="en-US"/>
-        </w:rPr>
-        <w:t xml:space="preserve">, C. Mitchell (LBNL), R. Roussel (SLAC), J. Kaiser (DESY), C. Xu (Argonne), J.-L. Vay, R. </w:t>
-      </w:r>
-      <w:proofErr w:type="spellStart"/>
-      <w:r>
-        <w:rPr>
-          <w:rStyle w:val="SchwacheHervorhebung"/>
-          <w:lang w:val="en-US"/>
-        </w:rPr>
-        <w:t>Lehe</w:t>
-      </w:r>
-      <w:proofErr w:type="spellEnd"/>
-      <w:r>
-        <w:rPr>
-          <w:rStyle w:val="SchwacheHervorhebung"/>
-          <w:lang w:val="en-US"/>
-        </w:rPr>
-        <w:t xml:space="preserve"> (LBNL) — PASC '26</w:t>
+        <w:t>Von A. Dhamrait, E. Zoni, A. Huebl, J. Qiang, C. Mitchell (LBNL), R. Roussel (SLAC), J. Kaiser (DESY), C. Xu (Argonne), J.-L. Vay, R. Lehe (LBNL) — PASC '26</w:t>
       </w:r>
     </w:p>
     <w:p>
@@ -1101,103 +1021,39 @@
           <w:rFonts w:eastAsiaTheme="minorEastAsia"/>
           <w:i/>
         </w:rPr>
-        <w:t>_</w:t>
-      </w:r>
-      <w:proofErr w:type="spellStart"/>
+        <w:t xml:space="preserve">_solve_poisson_equation() </w:t>
+      </w:r>
+      <w:r>
+        <w:rPr>
+          <w:rFonts w:eastAsiaTheme="minorEastAsia"/>
+        </w:rPr>
+        <w:t xml:space="preserve"> via </w:t>
+      </w:r>
       <w:r>
         <w:rPr>
           <w:rFonts w:eastAsiaTheme="minorEastAsia"/>
           <w:i/>
         </w:rPr>
-        <w:t>solve_poisson_</w:t>
-      </w:r>
-      <w:proofErr w:type="gramStart"/>
+        <w:t>_integrated_green_function()</w:t>
+      </w:r>
+      <w:r>
+        <w:rPr>
+          <w:rFonts w:eastAsiaTheme="minorEastAsia"/>
+        </w:rPr>
+        <w:t xml:space="preserve"> (IGF)</w:t>
+      </w:r>
+      <w:r>
+        <w:rPr>
+          <w:rFonts w:eastAsiaTheme="minorEastAsia"/>
+        </w:rPr>
+        <w:t xml:space="preserve">, was wiederum </w:t>
+      </w:r>
       <w:r>
         <w:rPr>
           <w:rFonts w:eastAsiaTheme="minorEastAsia"/>
           <w:i/>
         </w:rPr>
-        <w:t>equation</w:t>
-      </w:r>
-      <w:proofErr w:type="spellEnd"/>
-      <w:r>
-        <w:rPr>
-          <w:rFonts w:eastAsiaTheme="minorEastAsia"/>
-          <w:i/>
-        </w:rPr>
-        <w:t>(</w:t>
-      </w:r>
-      <w:proofErr w:type="gramEnd"/>
-      <w:r>
-        <w:rPr>
-          <w:rFonts w:eastAsiaTheme="minorEastAsia"/>
-          <w:i/>
-        </w:rPr>
-        <w:t xml:space="preserve">) </w:t>
-      </w:r>
-      <w:r>
-        <w:rPr>
-          <w:rFonts w:eastAsiaTheme="minorEastAsia"/>
-        </w:rPr>
-        <w:t xml:space="preserve"> via </w:t>
-      </w:r>
-      <w:r>
-        <w:rPr>
-          <w:rFonts w:eastAsiaTheme="minorEastAsia"/>
-          <w:i/>
-        </w:rPr>
-        <w:t>_</w:t>
-      </w:r>
-      <w:proofErr w:type="spellStart"/>
-      <w:r>
-        <w:rPr>
-          <w:rFonts w:eastAsiaTheme="minorEastAsia"/>
-          <w:i/>
-        </w:rPr>
-        <w:t>integrated_green_function</w:t>
-      </w:r>
-      <w:proofErr w:type="spellEnd"/>
-      <w:r>
-        <w:rPr>
-          <w:rFonts w:eastAsiaTheme="minorEastAsia"/>
-          <w:i/>
-        </w:rPr>
-        <w:t>()</w:t>
-      </w:r>
-      <w:r>
-        <w:rPr>
-          <w:rFonts w:eastAsiaTheme="minorEastAsia"/>
-        </w:rPr>
-        <w:t xml:space="preserve"> (IGF)</w:t>
-      </w:r>
-      <w:r>
-        <w:rPr>
-          <w:rFonts w:eastAsiaTheme="minorEastAsia"/>
-        </w:rPr>
-        <w:t xml:space="preserve">, was wiederum </w:t>
-      </w:r>
-      <w:r>
-        <w:rPr>
-          <w:rFonts w:eastAsiaTheme="minorEastAsia"/>
-          <w:i/>
-        </w:rPr>
-        <w:t>_</w:t>
-      </w:r>
-      <w:proofErr w:type="spellStart"/>
-      <w:r>
-        <w:rPr>
-          <w:rFonts w:eastAsiaTheme="minorEastAsia"/>
-          <w:i/>
-        </w:rPr>
-        <w:t>integrated_potential</w:t>
-      </w:r>
-      <w:proofErr w:type="spellEnd"/>
-      <w:r>
-        <w:rPr>
-          <w:rFonts w:eastAsiaTheme="minorEastAsia"/>
-          <w:i/>
-        </w:rPr>
-        <w:t xml:space="preserve">() </w:t>
+        <w:t xml:space="preserve">_integrated_potential() </w:t>
       </w:r>
       <w:r>
         <w:rPr>
@@ -1964,21 +1820,12 @@
           <w:lang w:val="en-US"/>
         </w:rPr>
       </w:pPr>
-      <w:proofErr w:type="spellStart"/>
       <w:r>
         <w:rPr>
           <w:rFonts w:ascii="Cambria Math" w:eastAsiaTheme="minorEastAsia" w:hAnsi="Cambria Math" w:cs="Cambria Math"/>
           <w:lang w:val="en-US"/>
         </w:rPr>
-        <w:t>Zitat</w:t>
-      </w:r>
-      <w:proofErr w:type="spellEnd"/>
-      <w:r>
-        <w:rPr>
-          <w:rFonts w:ascii="Cambria Math" w:eastAsiaTheme="minorEastAsia" w:hAnsi="Cambria Math" w:cs="Cambria Math"/>
-          <w:lang w:val="en-US"/>
-        </w:rPr>
-        <w:t xml:space="preserve"> S.8: </w:t>
+        <w:t xml:space="preserve">Zitat S.8: </w:t>
       </w:r>
       <w:r>
         <w:rPr>
@@ -2070,63 +1917,7 @@
       </w:pPr>
       <w:r>
         <w:lastRenderedPageBreak/>
-        <w:t>ACHTUNG — hier ging mir Löser und Surrogat durcheinander. Dieses Papier behandelt den ECHTEN PIC-Löser („FFT-</w:t>
-      </w:r>
-      <w:proofErr w:type="spellStart"/>
-      <w:r>
-        <w:t>based</w:t>
-      </w:r>
-      <w:proofErr w:type="spellEnd"/>
-      <w:r>
-        <w:t xml:space="preserve"> </w:t>
-      </w:r>
-      <w:proofErr w:type="spellStart"/>
-      <w:r>
-        <w:t>space</w:t>
-      </w:r>
-      <w:proofErr w:type="spellEnd"/>
-      <w:r>
-        <w:t xml:space="preserve"> </w:t>
-      </w:r>
-      <w:proofErr w:type="spellStart"/>
-      <w:r>
-        <w:t>charge</w:t>
-      </w:r>
-      <w:proofErr w:type="spellEnd"/>
-      <w:r>
-        <w:t xml:space="preserve"> </w:t>
-      </w:r>
-      <w:proofErr w:type="spellStart"/>
-      <w:r>
-        <w:t>with</w:t>
-      </w:r>
-      <w:proofErr w:type="spellEnd"/>
-      <w:r>
-        <w:t xml:space="preserve"> reverse-mode </w:t>
-      </w:r>
-      <w:proofErr w:type="spellStart"/>
-      <w:r>
-        <w:t>differentiation</w:t>
-      </w:r>
-      <w:proofErr w:type="spellEnd"/>
-      <w:r>
-        <w:t xml:space="preserve">“, S. 8), nicht das NN-Ersatzmodell. Der Löser rechnet Physik aus, das Surrogat rät sie. Die Antwort auf Frage 3 steht im Kaiser-Blatt (Kap. III.E: Residuum-Ansatz auf </w:t>
-      </w:r>
-      <w:proofErr w:type="spellStart"/>
-      <w:r>
-        <w:t>ParameterBeam</w:t>
-      </w:r>
-      <w:proofErr w:type="spellEnd"/>
-      <w:r>
-        <w:t xml:space="preserve">, </w:t>
-      </w:r>
-      <w:proofErr w:type="gramStart"/>
-      <w:r>
-        <w:t>ein einzelnes Quadrupol</w:t>
-      </w:r>
-      <w:proofErr w:type="gramEnd"/>
-      <w:r>
-        <w:t>).</w:t>
+        <w:t>ACHTUNG — hier ging mir Löser und Surrogat durcheinander. Dieses Papier behandelt den ECHTEN PIC-Löser („FFT-based space charge with reverse-mode differentiation“, S. 8), nicht das NN-Ersatzmodell. Der Löser rechnet Physik aus, das Surrogat rät sie. Die Antwort auf Frage 3 steht im Kaiser-Blatt (Kap. III.E: Residuum-Ansatz auf ParameterBeam, ein einzelnes Quadrupol).</w:t>
       </w:r>
     </w:p>
     <w:p>
@@ -4129,7 +3920,31 @@
         </w:numPr>
       </w:pPr>
       <w:r>
-        <w:t>Gemessen auf einer NVIDIA A100 mit 80 GB (NERSC Perlmutter) — ohne die Hardware ist eine Speicherangabe halb wertlos</w:t>
+        <w:t xml:space="preserve">Gemessen auf einer </w:t>
+      </w:r>
+      <w:r>
+        <w:rPr>
+          <w:highlight w:val="yellow"/>
+          <w:u w:val="single"/>
+        </w:rPr>
+        <w:t>NVIDIA A100 mit 80 GB</w:t>
+      </w:r>
+      <w:r>
+        <w:rPr>
+          <w:highlight w:val="yellow"/>
+          <w:u w:val="single"/>
+        </w:rPr>
+        <w:t xml:space="preserve"> RAM</w:t>
+      </w:r>
+      <w:r>
+        <w:rPr>
+          <w:highlight w:val="yellow"/>
+          <w:u w:val="single"/>
+        </w:rPr>
+        <w:t xml:space="preserve"> (NERSC Perlmutter)</w:t>
+      </w:r>
+      <w:r>
+        <w:t xml:space="preserve"> — ohne die Hardware ist eine Speicherangabe halb wertlos</w:t>
       </w:r>
     </w:p>
     <w:p>
@@ -4203,13 +4018,8 @@
       <w:r>
         <w:t>Claude Opus 4.8 Mittel vom 14.08.2026: Chat „</w:t>
       </w:r>
-      <w:proofErr w:type="spellStart"/>
-      <w:r>
-        <w:t>Neural</w:t>
-      </w:r>
-      <w:proofErr w:type="spellEnd"/>
-      <w:r>
-        <w:t xml:space="preserve"> Operators für Surrogate Modelle in Cheetah</w:t>
+      <w:r>
+        <w:t>Neural Operators für Surrogate Modelle in Cheetah</w:t>
       </w:r>
       <w:r>
         <w:t>“ im Projekt „</w:t>
@@ -4232,32 +4042,7 @@
         <w:t xml:space="preserve">): </w:t>
       </w:r>
       <w:r>
-        <w:t>Was kostet, sind (a) die elementweise berechnete Green-Funktion → O(</w:t>
-      </w:r>
-      <w:proofErr w:type="spellStart"/>
-      <w:r>
-        <w:t>N_cells</w:t>
-      </w:r>
-      <w:proofErr w:type="spellEnd"/>
-      <w:r>
-        <w:t>) und (b) Charge Deposition plus Field Gather → O(</w:t>
-      </w:r>
-      <w:proofErr w:type="spellStart"/>
-      <w:r>
-        <w:t>N_part</w:t>
-      </w:r>
-      <w:proofErr w:type="spellEnd"/>
-      <w:r>
-        <w:t>)</w:t>
-      </w:r>
-    </w:p>
-    <w:p/>
-    <w:p>
-      <w:pPr>
-        <w:pStyle w:val="berschrift1"/>
-      </w:pPr>
-      <w:r>
-        <w:t>Was das Papier nicht berücksichtigt</w:t>
+        <w:t>Was kostet, sind (a) die elementweise berechnete Green-Funktion → O(N_cells) und (b) Charge Deposition plus Field Gather → O(N_part)</w:t>
       </w:r>
     </w:p>
     <w:p>
@@ -4267,9 +4052,51 @@
           <w:ilvl w:val="0"/>
           <w:numId w:val="1"/>
         </w:numPr>
-      </w:pPr>
-      <w:r>
-        <w:t>Kein Wort zur RECHENZEIT des Lösers. Gemessen wird ausschließlich Speicher. Für einen Vergleich „Surrogat gegen Löser“ fehlt mir damit eine ganze Achse — die muss ich selbst messen.</w:t>
+        <w:rPr>
+          <w:lang w:val="en-US"/>
+        </w:rPr>
+      </w:pPr>
+      <w:r>
+        <w:rPr>
+          <w:lang w:val="en-US"/>
+        </w:rPr>
+        <w:t>S. 8: „we expect the finding of linear memory</w:t>
+      </w:r>
+      <w:r>
+        <w:rPr>
+          <w:lang w:val="en-US"/>
+        </w:rPr>
+        <w:t xml:space="preserve"> </w:t>
+      </w:r>
+      <w:r>
+        <w:rPr>
+          <w:lang w:val="en-US"/>
+        </w:rPr>
+        <w:t>scaling with simulation resolution to generalize beyond Cheetah to any code implementing FFT-based space charge with reverse-mode differentiation.“</w:t>
+      </w:r>
+    </w:p>
+    <w:p>
+      <w:pPr>
+        <w:pStyle w:val="Listenabsatz"/>
+        <w:numPr>
+          <w:ilvl w:val="1"/>
+          <w:numId w:val="1"/>
+        </w:numPr>
+      </w:pPr>
+      <w:r>
+        <w:t xml:space="preserve">=&gt; Motivation für NO: Soll </w:t>
+      </w:r>
+      <w:r>
+        <w:t>Berechnung (Zeit und Speicher) unabhängig von Auflösung machen</w:t>
+      </w:r>
+    </w:p>
+    <w:p/>
+    <w:p>
+      <w:pPr>
+        <w:pStyle w:val="berschrift1"/>
+      </w:pPr>
+      <w:r>
+        <w:t>Was das Papier nicht berücksichtigt</w:t>
       </w:r>
     </w:p>
     <w:p>
@@ -4281,7 +4108,7 @@
         </w:numPr>
       </w:pPr>
       <w:r>
-        <w:t>Keine iterativen Löser. Multigrid, GMRES und Verwandte kommen nur im Ausblick vor; ihr Speicherverhalten weicht vermutlich vom linearen Gesetz ab, und die Autoren sagen ausdrücklich, dass sie es nicht untersucht haben. Relevant, sobald echte Strahlrohrgeometrien ins Spiel kommen.</w:t>
+        <w:t>Kein Wort zur RECHENZEIT des Lösers. Gemessen wird ausschließlich Speicher. Für einen Vergleich „Surrogat gegen Löser“ fehlt mir damit eine ganze Achse — die muss ich selbst messen.</w:t>
       </w:r>
     </w:p>
     <w:p>
@@ -4294,7 +4121,7 @@
       </w:pPr>
       <w:r>
         <w:lastRenderedPageBreak/>
-        <w:t>Kein Ausweg außer Gradient Checkpointing. Läuft der Speicher voll, ist das die einzige angebotene Antwort — und sie kostet Rechenzeit. Ein Ersatzmodell wäre die andere Antwort, taucht hier aber nicht auf.</w:t>
+        <w:t>Keine iterativen Löser. Multigrid, GMRES und Verwandte kommen nur im Ausblick vor; ihr Speicherverhalten weicht vermutlich vom linearen Gesetz ab, und die Autoren sagen ausdrücklich, dass sie es nicht untersucht haben. Relevant, sobald echte Strahlrohrgeometrien ins Spiel kommen.</w:t>
       </w:r>
     </w:p>
     <w:p>
@@ -4306,7 +4133,7 @@
         </w:numPr>
       </w:pPr>
       <w:r>
-        <w:t>Kein Grenzwert. Es steht nirgends, ab wie vielen Kicks es tatsächlich eng wird. Die Autoren deuten „tausende Umläufe“ an, ohne es durchzurechnen.</w:t>
+        <w:t>Kein Ausweg außer Gradient Checkpointing. Läuft der Speicher voll, ist das die einzige angebotene Antwort — und sie kostet Rechenzeit. Ein Ersatzmodell wäre die andere Antwort, taucht hier aber nicht auf.</w:t>
       </w:r>
     </w:p>
     <w:p>
@@ -4318,16 +4145,7 @@
         </w:numPr>
       </w:pPr>
       <w:r>
-        <w:t>Kein NN-Surrogat. Dieses Papier kennt nur den echten Löser.</w:t>
-      </w:r>
-    </w:p>
-    <w:p/>
-    <w:p>
-      <w:pPr>
-        <w:pStyle w:val="berschrift1"/>
-      </w:pPr>
-      <w:r>
-        <w:t>Offene Fragen</w:t>
+        <w:t>Kein Grenzwert. Es steht nirgends, ab wie vielen Kicks es tatsächlich eng wird. Die Autoren deuten „tausende Umläufe“ an, ohne es durchzurechnen.</w:t>
       </w:r>
     </w:p>
     <w:p>
@@ -4339,6 +4157,27 @@
         </w:numPr>
       </w:pPr>
       <w:r>
+        <w:t>Kein NN-Surrogat. Dieses Papier kennt nur den echten Löser.</w:t>
+      </w:r>
+    </w:p>
+    <w:p/>
+    <w:p>
+      <w:pPr>
+        <w:pStyle w:val="berschrift1"/>
+      </w:pPr>
+      <w:r>
+        <w:t>Offene Fragen</w:t>
+      </w:r>
+    </w:p>
+    <w:p>
+      <w:pPr>
+        <w:pStyle w:val="Listenabsatz"/>
+        <w:numPr>
+          <w:ilvl w:val="0"/>
+          <w:numId w:val="1"/>
+        </w:numPr>
+      </w:pPr>
+      <w:r>
         <w:t>Soll untersucht werden, welchen Vorteil Cheetah bei Reverse-Mode Automatic Differentiation Methoden bietet im Gegensatz zu konventionellen Solvern/ Optimizern/ Simulationen?</w:t>
       </w:r>
     </w:p>
@@ -4424,6 +4263,7 @@
         <w:pStyle w:val="berschrift1"/>
       </w:pPr>
       <w:r>
+        <w:lastRenderedPageBreak/>
         <w:t>Was das für meine Arbeit bedeutet</w:t>
       </w:r>
     </w:p>
@@ -4440,15 +4280,7 @@
           <w:b/>
           <w:bCs/>
         </w:rPr>
-        <w:t xml:space="preserve">BEGRÜNDUNG: Speicher wächst proportional zur Zahl der Kicks. Jeder Kick legt seinen Anteil ab und behält ihn bis zum Rückwärtsdurchlauf. Ein Ersatzmodell, das einen Kick oder eine ganze Sektion in einem Aufruf erledigt, hat dagegen einen FESTEN Fußabdruck — unabhängig von </w:t>
-      </w:r>
-      <w:r>
-        <w:rPr>
-          <w:b/>
-          <w:bCs/>
-        </w:rPr>
-        <w:lastRenderedPageBreak/>
-        <w:t>Teilchenzahl und Gittergröße. Das ist ein quantitatives Argument aus fremder Feder, an dem DESY beteiligt ist.</w:t>
+        <w:t>BEGRÜNDUNG: Speicher wächst proportional zur Zahl der Kicks. Jeder Kick legt seinen Anteil ab und behält ihn bis zum Rückwärtsdurchlauf. Ein Ersatzmodell, das einen Kick oder eine ganze Sektion in einem Aufruf erledigt, hat dagegen einen FESTEN Fußabdruck — unabhängig von Teilchenzahl und Gittergröße. Das ist ein quantitatives Argument aus fremder Feder, an dem DESY beteiligt ist.</w:t>
       </w:r>
     </w:p>
     <w:p>
@@ -5629,6 +5461,7 @@
   <w:style w:type="character" w:default="1" w:styleId="Absatz-Standardschriftart">
     <w:name w:val="Default Paragraph Font"/>
     <w:uiPriority w:val="1"/>
+    <w:semiHidden/>
     <w:unhideWhenUsed/>
   </w:style>
   <w:style w:type="table" w:default="1" w:styleId="NormaleTabelle">

</xml_diff>